<commit_message>
Journal: mark branch protection done, add filters/cold-start/auth backlog
Co-Authored-By: Claude Opus 4.7 <noreply@anthropic.com>
</commit_message>
<xml_diff>
--- a/DEPLOYMENT_JOURNAL.docx
+++ b/DEPLOYMENT_JOURNAL.docx
@@ -4018,6 +4018,14 @@
     </w:p>
     <w:p>
       <w:pPr>
+        <w:pStyle w:val="FirstParagraph"/>
+      </w:pPr>
+      <w:r>
+        <w:t xml:space="preserve">Done since the first cut:</w:t>
+      </w:r>
+    </w:p>
+    <w:p>
+      <w:pPr>
         <w:pStyle w:val="Compact"/>
         <w:numPr>
           <w:ilvl w:val="0"/>
@@ -4035,19 +4043,21 @@
         <w:t xml:space="preserve"> </w:t>
       </w:r>
       <w:r>
-        <w:t xml:space="preserve">on the code repository, so changes must pass the</w:t>
-      </w:r>
-      <w:r>
-        <w:t xml:space="preserve"> </w:t>
-      </w:r>
-      <w:r>
-        <w:t xml:space="preserve">automated checks before reaching the live site (approved, ready to switch</w:t>
-      </w:r>
-      <w:r>
-        <w:t xml:space="preserve"> </w:t>
-      </w:r>
-      <w:r>
-        <w:t xml:space="preserve">on).</w:t>
+        <w:t xml:space="preserve">on the code repository is now switched on — changes</w:t>
+      </w:r>
+      <w:r>
+        <w:t xml:space="preserve"> </w:t>
+      </w:r>
+      <w:r>
+        <w:t xml:space="preserve">must pass the automated checks before reaching the live site.</w:t>
+      </w:r>
+    </w:p>
+    <w:p>
+      <w:pPr>
+        <w:pStyle w:val="FirstParagraph"/>
+      </w:pPr>
+      <w:r>
+        <w:t xml:space="preserve">Planned next (the backlog as it stands):</w:t>
       </w:r>
     </w:p>
     <w:p>
@@ -4055,7 +4065,7 @@
         <w:pStyle w:val="Compact"/>
         <w:numPr>
           <w:ilvl w:val="0"/>
-          <w:numId w:val="1004"/>
+          <w:numId w:val="1005"/>
         </w:numPr>
       </w:pPr>
       <w:r>
@@ -4063,19 +4073,25 @@
           <w:b/>
           <w:bCs/>
         </w:rPr>
-        <w:t xml:space="preserve">Cleanup:</w:t>
-      </w:r>
-      <w:r>
-        <w:t xml:space="preserve"> </w:t>
-      </w:r>
-      <w:r>
-        <w:t xml:space="preserve">delete the now-unused old Render frontend and database services</w:t>
-      </w:r>
-      <w:r>
-        <w:t xml:space="preserve"> </w:t>
-      </w:r>
-      <w:r>
-        <w:t xml:space="preserve">so they don’t count against the free budget.</w:t>
+        <w:t xml:space="preserve">More ways to filter the catalogue</w:t>
+      </w:r>
+      <w:r>
+        <w:t xml:space="preserve"> </w:t>
+      </w:r>
+      <w:r>
+        <w:t xml:space="preserve">— by genre, by decade, by cast member,</w:t>
+      </w:r>
+      <w:r>
+        <w:t xml:space="preserve"> </w:t>
+      </w:r>
+      <w:r>
+        <w:t xml:space="preserve">and by streaming service. The data we already cache (genres, credits, watch</w:t>
+      </w:r>
+      <w:r>
+        <w:t xml:space="preserve"> </w:t>
+      </w:r>
+      <w:r>
+        <w:t xml:space="preserve">providers) makes these natural next steps rather than new plumbing.</w:t>
       </w:r>
     </w:p>
     <w:p>
@@ -4083,7 +4099,109 @@
         <w:pStyle w:val="Compact"/>
         <w:numPr>
           <w:ilvl w:val="0"/>
-          <w:numId w:val="1004"/>
+          <w:numId w:val="1005"/>
+        </w:numPr>
+      </w:pPr>
+      <w:r>
+        <w:rPr>
+          <w:b/>
+          <w:bCs/>
+        </w:rPr>
+        <w:t xml:space="preserve">Smooth out the remaining cold-start</w:t>
+      </w:r>
+      <w:r>
+        <w:t xml:space="preserve"> </w:t>
+      </w:r>
+      <w:r>
+        <w:t xml:space="preserve">— even with the keep-warm ping, the</w:t>
+      </w:r>
+      <w:r>
+        <w:t xml:space="preserve"> </w:t>
+      </w:r>
+      <w:r>
+        <w:t xml:space="preserve">very first visit after an idle stretch is still slow to paint posters and</w:t>
+      </w:r>
+      <w:r>
+        <w:t xml:space="preserve"> </w:t>
+      </w:r>
+      <w:r>
+        <w:t xml:space="preserve">artwork. Worth profiling image loading and the first-request path so a new</w:t>
+      </w:r>
+      <w:r>
+        <w:t xml:space="preserve"> </w:t>
+      </w:r>
+      <w:r>
+        <w:t xml:space="preserve">visitor never waits.</w:t>
+      </w:r>
+    </w:p>
+    <w:p>
+      <w:pPr>
+        <w:pStyle w:val="Compact"/>
+        <w:numPr>
+          <w:ilvl w:val="0"/>
+          <w:numId w:val="1005"/>
+        </w:numPr>
+      </w:pPr>
+      <w:r>
+        <w:rPr>
+          <w:b/>
+          <w:bCs/>
+        </w:rPr>
+        <w:t xml:space="preserve">Exercise the accounts/login path under real use</w:t>
+      </w:r>
+      <w:r>
+        <w:t xml:space="preserve"> </w:t>
+      </w:r>
+      <w:r>
+        <w:t xml:space="preserve">— sign-up, sign-in, and</w:t>
+      </w:r>
+      <w:r>
+        <w:t xml:space="preserve"> </w:t>
+      </w:r>
+      <w:r>
+        <w:t xml:space="preserve">watching how the database behaves as real users and their libraries accumulate</w:t>
+      </w:r>
+      <w:r>
+        <w:t xml:space="preserve"> </w:t>
+      </w:r>
+      <w:r>
+        <w:t xml:space="preserve">(connection limits on the free database, query performance as rows grow).</w:t>
+      </w:r>
+    </w:p>
+    <w:p>
+      <w:pPr>
+        <w:pStyle w:val="Compact"/>
+        <w:numPr>
+          <w:ilvl w:val="0"/>
+          <w:numId w:val="1005"/>
+        </w:numPr>
+      </w:pPr>
+      <w:r>
+        <w:rPr>
+          <w:b/>
+          <w:bCs/>
+        </w:rPr>
+        <w:t xml:space="preserve">Cleanup:</w:t>
+      </w:r>
+      <w:r>
+        <w:t xml:space="preserve"> </w:t>
+      </w:r>
+      <w:r>
+        <w:t xml:space="preserve">delete the now-unused old Render frontend and database services</w:t>
+      </w:r>
+      <w:r>
+        <w:t xml:space="preserve"> </w:t>
+      </w:r>
+      <w:r>
+        <w:t xml:space="preserve">so they don’t count against the free budget.</w:t>
+      </w:r>
+    </w:p>
+    <w:p>
+      <w:pPr>
+        <w:pStyle w:val="Compact"/>
+        <w:numPr>
+          <w:ilvl w:val="0"/>
+          <w:numId w:val="1005"/>
         </w:numPr>
       </w:pPr>
       <w:r>
@@ -4395,6 +4513,9 @@
     <w:abstractNumId w:val="991"/>
   </w:num>
   <w:num w:numId="1004">
+    <w:abstractNumId w:val="991"/>
+  </w:num>
+  <w:num w:numId="1005">
     <w:abstractNumId w:val="991"/>
   </w:num>
 </w:numbering>

</xml_diff>